<commit_message>
docs: update project brief — mark public status page done, add PING/status screenshots, add Public Status Page to features built
Co-Authored-By: Claude Sonnet 4.6 <noreply@anthropic.com>
</commit_message>
<xml_diff>
--- a/PulseWatch v2.docx
+++ b/PulseWatch v2.docx
@@ -39,7 +39,7 @@
     </w:p>
     <w:p>
       <w:r>
-        <w:t>PulseWatch is a self-hosted uptime and status dashboard. It monitors HTTP and TCP services and shows live status, response times, sparklines, SSL certificate health, check history, and incident tracking — all in a single-page app with no npm dependencies.</w:t>
+        <w:t>PulseWatch is a self-hosted uptime and status dashboard. It monitors HTTP, TCP, and PING services and shows live status, response times, sparklines, SSL certificate health, check history, and incident tracking — all in a single-page app with no npm dependencies.</w:t>
       </w:r>
     </w:p>
     <w:p/>
@@ -499,6 +499,112 @@
       </w:r>
     </w:p>
     <w:p/>
+    <w:p>
+      <w:pPr>
+        <w:jc w:val="center"/>
+      </w:pPr>
+      <w:r>
+        <w:drawing>
+          <wp:inline xmlns:a="http://schemas.openxmlformats.org/drawingml/2006/main" xmlns:pic="http://schemas.openxmlformats.org/drawingml/2006/picture">
+            <wp:extent cx="2743200" cy="2024292"/>
+            <wp:docPr id="6" name="Picture 6"/>
+            <wp:cNvGraphicFramePr>
+              <a:graphicFrameLocks noChangeAspect="1"/>
+            </wp:cNvGraphicFramePr>
+            <a:graphic>
+              <a:graphicData uri="http://schemas.openxmlformats.org/drawingml/2006/picture">
+                <pic:pic>
+                  <pic:nvPicPr>
+                    <pic:cNvPr id="0" name="ping_card.png"/>
+                    <pic:cNvPicPr/>
+                  </pic:nvPicPr>
+                  <pic:blipFill>
+                    <a:blip r:embed="rId14"/>
+                    <a:stretch>
+                      <a:fillRect/>
+                    </a:stretch>
+                  </pic:blipFill>
+                  <pic:spPr>
+                    <a:xfrm>
+                      <a:off x="0" y="0"/>
+                      <a:ext cx="2743200" cy="2024292"/>
+                    </a:xfrm>
+                    <a:prstGeom prst="rect"/>
+                  </pic:spPr>
+                </pic:pic>
+              </a:graphicData>
+            </a:graphic>
+          </wp:inline>
+        </w:drawing>
+      </w:r>
+    </w:p>
+    <w:p>
+      <w:pPr>
+        <w:jc w:val="center"/>
+      </w:pPr>
+      <w:r>
+        <w:rPr>
+          <w:i/>
+          <w:color w:val="94A3B8"/>
+          <w:sz w:val="18"/>
+        </w:rPr>
+        <w:t>PING monitor card — real ICMP RTT from system ping</w:t>
+      </w:r>
+    </w:p>
+    <w:p/>
+    <w:p>
+      <w:pPr>
+        <w:jc w:val="center"/>
+      </w:pPr>
+      <w:r>
+        <w:drawing>
+          <wp:inline xmlns:a="http://schemas.openxmlformats.org/drawingml/2006/main" xmlns:pic="http://schemas.openxmlformats.org/drawingml/2006/picture">
+            <wp:extent cx="4572000" cy="3200400"/>
+            <wp:docPr id="5" name="Picture 5"/>
+            <wp:cNvGraphicFramePr>
+              <a:graphicFrameLocks noChangeAspect="1"/>
+            </wp:cNvGraphicFramePr>
+            <a:graphic>
+              <a:graphicData uri="http://schemas.openxmlformats.org/drawingml/2006/picture">
+                <pic:pic>
+                  <pic:nvPicPr>
+                    <pic:cNvPr id="0" name="public_status.png"/>
+                    <pic:cNvPicPr/>
+                  </pic:nvPicPr>
+                  <pic:blipFill>
+                    <a:blip r:embed="rId13"/>
+                    <a:stretch>
+                      <a:fillRect/>
+                    </a:stretch>
+                  </pic:blipFill>
+                  <pic:spPr>
+                    <a:xfrm>
+                      <a:off x="0" y="0"/>
+                      <a:ext cx="4572000" cy="3200400"/>
+                    </a:xfrm>
+                    <a:prstGeom prst="rect"/>
+                  </pic:spPr>
+                </pic:pic>
+              </a:graphicData>
+            </a:graphic>
+          </wp:inline>
+        </w:drawing>
+      </w:r>
+    </w:p>
+    <w:p>
+      <w:pPr>
+        <w:jc w:val="center"/>
+      </w:pPr>
+      <w:r>
+        <w:rPr>
+          <w:i/>
+          <w:color w:val="94A3B8"/>
+          <w:sz w:val="18"/>
+        </w:rPr>
+        <w:t>Public status page — shareable, no login required</w:t>
+      </w:r>
+    </w:p>
+    <w:p/>
     <w:p/>
     <w:p>
       <w:pPr>
@@ -1559,6 +1665,75 @@
     </w:p>
     <w:p/>
     <w:p>
+      <w:r/>
+    </w:p>
+    <w:p>
+      <w:pPr>
+        <w:pStyle w:val="ListBullet"/>
+      </w:pPr>
+      <w:r>
+        <w:rPr>
+          <w:color w:val="059669"/>
+        </w:rPr>
+        <w:t xml:space="preserve">✅  </w:t>
+      </w:r>
+      <w:r>
+        <w:t>Auto-refreshes every 30 s; respects system dark/light preference</w:t>
+      </w:r>
+    </w:p>
+    <w:p>
+      <w:pPr>
+        <w:pStyle w:val="ListBullet"/>
+      </w:pPr>
+      <w:r>
+        <w:rPr>
+          <w:color w:val="059669"/>
+        </w:rPr>
+        <w:t xml:space="preserve">✅  </w:t>
+      </w:r>
+      <w:r>
+        <w:t>Separate /api/public/status endpoint also requires no authentication</w:t>
+      </w:r>
+    </w:p>
+    <w:p>
+      <w:pPr>
+        <w:pStyle w:val="ListBullet"/>
+      </w:pPr>
+      <w:r>
+        <w:rPr>
+          <w:color w:val="059669"/>
+        </w:rPr>
+        <w:t xml:space="preserve">✅  </w:t>
+      </w:r>
+      <w:r>
+        <w:t>Shows overall status banner (All Systems Operational / Partial Outage / etc.)</w:t>
+      </w:r>
+    </w:p>
+    <w:p>
+      <w:pPr>
+        <w:pStyle w:val="ListBullet"/>
+      </w:pPr>
+      <w:r>
+        <w:rPr>
+          <w:color w:val="059669"/>
+        </w:rPr>
+        <w:t xml:space="preserve">✅  </w:t>
+      </w:r>
+      <w:r>
+        <w:t>Public status page at /status — shareable with users, no login required</w:t>
+      </w:r>
+    </w:p>
+    <w:p>
+      <w:r>
+        <w:rPr>
+          <w:b/>
+          <w:color w:val="4F46E5"/>
+          <w:sz w:val="26"/>
+        </w:rPr>
+        <w:t>11. Public Status Page</w:t>
+      </w:r>
+    </w:p>
+    <w:p>
       <w:pPr>
         <w:pStyle w:val="Heading1"/>
       </w:pPr>
@@ -1653,12 +1828,12 @@
       </w:pPr>
       <w:r>
         <w:rPr>
-          <w:color w:val="64748B"/>
+          <w:color w:val="059669"/>
         </w:rPr>
-        <w:t xml:space="preserve">⬜  </w:t>
+        <w:t xml:space="preserve">✅  </w:t>
       </w:r>
       <w:r>
-        <w:t>Public status page — unauthenticated read-only view for sharing with users</w:t>
+        <w:t>Public status page — /status route, no login required, shows live status and 24h uptime %</w:t>
       </w:r>
     </w:p>
     <w:p>

</xml_diff>

<commit_message>
docs: update project brief with Docker support
Co-Authored-By: Claude Sonnet 4.6 <noreply@anthropic.com>
</commit_message>
<xml_diff>
--- a/PulseWatch v2.docx
+++ b/PulseWatch v2.docx
@@ -193,6 +193,28 @@
     </w:p>
     <w:p>
       <w:pPr>
+        <w:pStyle w:val="ListBullet"/>
+      </w:pPr>
+      <w:r>
+        <w:rPr>
+          <w:b/>
+        </w:rPr>
+        <w:t xml:space="preserve">docker-compose.yml  — port mapping, data volume, NET_RAW capability for PING  </w:t>
+      </w:r>
+    </w:p>
+    <w:p>
+      <w:pPr>
+        <w:pStyle w:val="ListBullet"/>
+      </w:pPr>
+      <w:r>
+        <w:rPr>
+          <w:b/>
+        </w:rPr>
+        <w:t xml:space="preserve">Dockerfile          — node:22-alpine image, app files in /app, data in /data via volume  </w:t>
+      </w:r>
+    </w:p>
+    <w:p>
+      <w:pPr>
         <w:pStyle w:val="Heading2"/>
       </w:pPr>
       <w:r>
@@ -285,6 +307,120 @@
         </w:rPr>
         <w:t>Screenshots</w:t>
       </w:r>
+    </w:p>
+    <w:p>
+      <w:pPr>
+        <w:pStyle w:val="ListBullet"/>
+      </w:pPr>
+      <w:r>
+        <w:rPr>
+          <w:color w:val="059669"/>
+        </w:rPr>
+        <w:t xml:space="preserve">✅  </w:t>
+      </w:r>
+      <w:r>
+        <w:t>Auto-creates default config.json on first run — no manual setup needed</w:t>
+      </w:r>
+    </w:p>
+    <w:p>
+      <w:pPr>
+        <w:pStyle w:val="ListBullet"/>
+      </w:pPr>
+      <w:r>
+        <w:rPr>
+          <w:color w:val="059669"/>
+        </w:rPr>
+        <w:t xml:space="preserve">✅  </w:t>
+      </w:r>
+      <w:r>
+        <w:t>DATA_DIR env var separates runtime data from app code — defaults to __dirname for non-Docker deploys</w:t>
+      </w:r>
+    </w:p>
+    <w:p>
+      <w:pPr>
+        <w:pStyle w:val="ListBullet"/>
+      </w:pPr>
+      <w:r>
+        <w:rPr>
+          <w:color w:val="059669"/>
+        </w:rPr>
+        <w:t xml:space="preserve">✅  </w:t>
+      </w:r>
+      <w:r>
+        <w:t>New files: Dockerfile, docker-compose.yml, .dockerignore</w:t>
+      </w:r>
+    </w:p>
+    <w:p>
+      <w:pPr>
+        <w:pStyle w:val="ListBullet"/>
+      </w:pPr>
+      <w:r>
+        <w:t>git clone https://github.com/jerryhobson-datageek/plusewatch.git &amp;&amp; cd plusewatch</w:t>
+      </w:r>
+    </w:p>
+    <w:p>
+      <w:pPr>
+        <w:pStyle w:val="ListBullet"/>
+      </w:pPr>
+      <w:r>
+        <w:t>docker compose up -d</w:t>
+      </w:r>
+    </w:p>
+    <w:p>
+      <w:pPr>
+        <w:pStyle w:val="ListBullet"/>
+      </w:pPr>
+      <w:r>
+        <w:t>Open http://localhost:3000. Default credentials auto-created on first run.</w:t>
+      </w:r>
+    </w:p>
+    <w:p>
+      <w:pPr>
+        <w:pStyle w:val="ListBullet"/>
+      </w:pPr>
+      <w:r>
+        <w:t>NET_RAW capability is included in docker-compose.yml — required for PING checks.</w:t>
+      </w:r>
+    </w:p>
+    <w:p>
+      <w:pPr>
+        <w:pStyle w:val="ListBullet"/>
+      </w:pPr>
+      <w:r>
+        <w:t>Runtime data (config.json, maintenance.json, history.db) is stored in ./data/ on the host and persists across rebuilds.</w:t>
+      </w:r>
+    </w:p>
+    <w:p>
+      <w:r/>
+    </w:p>
+    <w:p>
+      <w:pPr>
+        <w:pStyle w:val="ListBullet"/>
+      </w:pPr>
+      <w:r>
+        <w:rPr>
+          <w:rFonts w:ascii="Courier New" w:hAnsi="Courier New"/>
+          <w:color w:val="1E293B"/>
+          <w:sz w:val="18"/>
+        </w:rPr>
+        <w:t>docker compose up -d</w:t>
+      </w:r>
+    </w:p>
+    <w:p>
+      <w:r/>
+    </w:p>
+    <w:p>
+      <w:r>
+        <w:rPr>
+          <w:b/>
+          <w:color w:val="4F46E5"/>
+          <w:sz w:val="24"/>
+        </w:rPr>
+        <w:t>Docker Deployment (Alternative)</w:t>
+      </w:r>
+    </w:p>
+    <w:p>
+      <w:r/>
     </w:p>
     <w:p/>
     <w:p>

</xml_diff>

<commit_message>
docs: update project brief — mark consecutive failure threshold done, add Discord setup steps, add alertThreshold to service fields
Co-Authored-By: Claude Sonnet 4.6 <noreply@anthropic.com>
</commit_message>
<xml_diff>
--- a/PulseWatch v2.docx
+++ b/PulseWatch v2.docx
@@ -954,6 +954,20 @@
         <w:t xml:space="preserve">✅  </w:t>
       </w:r>
       <w:r>
+        <w:t>Alert threshold — number of consecutive failures before alerting (default: 1)</w:t>
+      </w:r>
+    </w:p>
+    <w:p>
+      <w:pPr>
+        <w:pStyle w:val="ListBullet"/>
+      </w:pPr>
+      <w:r>
+        <w:rPr>
+          <w:color w:val="059669"/>
+        </w:rPr>
+        <w:t xml:space="preserve">✅  </w:t>
+      </w:r>
+      <w:r>
         <w:t>Staggered startup — services start 600ms apart to avoid thundering herd</w:t>
       </w:r>
     </w:p>
@@ -1415,7 +1429,63 @@
         <w:t xml:space="preserve">✅  </w:t>
       </w:r>
       <w:r>
+        <w:t>Alert after N consecutive failures configurable per service (alertThreshold field) — default 1</w:t>
+      </w:r>
+    </w:p>
+    <w:p>
+      <w:pPr>
+        <w:pStyle w:val="ListBullet"/>
+      </w:pPr>
+      <w:r>
+        <w:rPr>
+          <w:color w:val="059669"/>
+        </w:rPr>
+        <w:t xml:space="preserve">✅  </w:t>
+      </w:r>
+      <w:r>
+        <w:t>Card shows dimmed N/threshold badge while below threshold so admins see failures without noise</w:t>
+      </w:r>
+    </w:p>
+    <w:p>
+      <w:pPr>
+        <w:pStyle w:val="ListBullet"/>
+      </w:pPr>
+      <w:r>
+        <w:rPr>
+          <w:color w:val="059669"/>
+        </w:rPr>
+        <w:t xml:space="preserve">✅  </w:t>
+      </w:r>
+      <w:r>
+        <w:t>Console log shows (N/threshold) counter: e.g. ✗ Portainer down 4ms (2/3)</w:t>
+      </w:r>
+    </w:p>
+    <w:p>
+      <w:pPr>
+        <w:pStyle w:val="ListBullet"/>
+      </w:pPr>
+      <w:r>
+        <w:rPr>
+          <w:color w:val="059669"/>
+        </w:rPr>
+        <w:t xml:space="preserve">✅  </w:t>
+      </w:r>
+      <w:r>
         <w:t>Discord webhook configured: id=discord01, all 3 events, stored in config.json</w:t>
+      </w:r>
+    </w:p>
+    <w:p>
+      <w:pPr>
+        <w:pStyle w:val="ListBullet"/>
+      </w:pPr>
+      <w:r>
+        <w:rPr>
+          <w:color w:val="059669"/>
+        </w:rPr>
+        <w:t xml:space="preserve">✅  </w:t>
+      </w:r>
+      <w:r>
+        <w:t>Discord setup: Server Settings → Integrations → Webhooks → New Webhook → Copy URL → paste in Alert Webhooks UI</w:t>
       </w:r>
     </w:p>
     <w:p>
@@ -1925,12 +1995,12 @@
       </w:pPr>
       <w:r>
         <w:rPr>
-          <w:color w:val="64748B"/>
+          <w:color w:val="059669"/>
         </w:rPr>
-        <w:t xml:space="preserve">⬜  </w:t>
+        <w:t xml:space="preserve">✅  </w:t>
       </w:r>
       <w:r>
-        <w:t>Consecutive failure threshold — only alert after N failures in a row</w:t>
+        <w:t>Consecutive failure threshold — configurable per service; card shows N/threshold counter while below threshold</w:t>
       </w:r>
     </w:p>
     <w:p>

</xml_diff>

<commit_message>
feat: add admin user management UI
Admins can now add/remove users and change roles from the dashboard
instead of editing config.json by hand. Adds GET/POST /api/users and
PATCH/DELETE /api/users/:username, a Users section on the dashboard,
and an Add User modal. Admins can't change their own role or delete
their own account, to prevent accidental lockout.

Co-Authored-By: Claude Sonnet 4.6 <noreply@anthropic.com>
</commit_message>
<xml_diff>
--- a/PulseWatch v2.docx
+++ b/PulseWatch v2.docx
@@ -22,7 +22,7 @@
         <w:rPr>
           <w:color w:val="64748B"/>
         </w:rPr>
-        <w:t>Updated: June 9, 2026</w:t>
+        <w:t>Updated: June 22, 2026</w:t>
       </w:r>
     </w:p>
     <w:p/>
@@ -742,6 +742,102 @@
     </w:p>
     <w:p/>
     <w:p/>
+    <w:p/>
+    <w:p>
+      <w:pPr>
+        <w:jc w:val="center"/>
+      </w:pPr>
+      <w:r>
+        <w:drawing>
+          <wp:inline xmlns:a="http://schemas.openxmlformats.org/drawingml/2006/main" xmlns:pic="http://schemas.openxmlformats.org/drawingml/2006/picture">
+            <wp:extent cx="5303520" cy="3409406"/>
+            <wp:docPr id="7" name="Picture 7"/>
+            <wp:cNvGraphicFramePr>
+              <a:graphicFrameLocks noChangeAspect="1"/>
+            </wp:cNvGraphicFramePr>
+            <a:graphic>
+              <a:graphicData uri="http://schemas.openxmlformats.org/drawingml/2006/picture">
+                <pic:pic>
+                  <pic:nvPicPr>
+                    <pic:cNvPr id="0" name="users_section.png"/>
+                    <pic:cNvPicPr/>
+                  </pic:nvPicPr>
+                  <pic:blipFill>
+                    <a:blip r:embed="rId15"/>
+                    <a:stretch>
+                      <a:fillRect/>
+                    </a:stretch>
+                  </pic:blipFill>
+                  <pic:spPr>
+                    <a:xfrm>
+                      <a:off x="0" y="0"/>
+                      <a:ext cx="5303520" cy="3409406"/>
+                    </a:xfrm>
+                    <a:prstGeom prst="rect"/>
+                  </pic:spPr>
+                </pic:pic>
+              </a:graphicData>
+            </a:graphic>
+          </wp:inline>
+        </w:drawing>
+      </w:r>
+    </w:p>
+    <w:p>
+      <w:pPr>
+        <w:jc w:val="center"/>
+      </w:pPr>
+      <w:r>
+        <w:t>Users section — admins, viewers, role toggle, and delete</w:t>
+      </w:r>
+    </w:p>
+    <w:p/>
+    <w:p>
+      <w:pPr>
+        <w:jc w:val="center"/>
+      </w:pPr>
+      <w:r>
+        <w:drawing>
+          <wp:inline xmlns:a="http://schemas.openxmlformats.org/drawingml/2006/main" xmlns:pic="http://schemas.openxmlformats.org/drawingml/2006/picture">
+            <wp:extent cx="5303520" cy="3409406"/>
+            <wp:docPr id="8" name="Picture 8"/>
+            <wp:cNvGraphicFramePr>
+              <a:graphicFrameLocks noChangeAspect="1"/>
+            </wp:cNvGraphicFramePr>
+            <a:graphic>
+              <a:graphicData uri="http://schemas.openxmlformats.org/drawingml/2006/picture">
+                <pic:pic>
+                  <pic:nvPicPr>
+                    <pic:cNvPr id="0" name="add_user_modal.png"/>
+                    <pic:cNvPicPr/>
+                  </pic:nvPicPr>
+                  <pic:blipFill>
+                    <a:blip r:embed="rId16"/>
+                    <a:stretch>
+                      <a:fillRect/>
+                    </a:stretch>
+                  </pic:blipFill>
+                  <pic:spPr>
+                    <a:xfrm>
+                      <a:off x="0" y="0"/>
+                      <a:ext cx="5303520" cy="3409406"/>
+                    </a:xfrm>
+                    <a:prstGeom prst="rect"/>
+                  </pic:spPr>
+                </pic:pic>
+              </a:graphicData>
+            </a:graphic>
+          </wp:inline>
+        </w:drawing>
+      </w:r>
+    </w:p>
+    <w:p>
+      <w:pPr>
+        <w:jc w:val="center"/>
+      </w:pPr>
+      <w:r>
+        <w:t>Add User modal</w:t>
+      </w:r>
+    </w:p>
     <w:p>
       <w:pPr>
         <w:pStyle w:val="Heading1"/>
@@ -1941,6 +2037,62 @@
     </w:p>
     <w:p>
       <w:pPr>
+        <w:pStyle w:val="Heading2"/>
+      </w:pPr>
+      <w:r>
+        <w:t>12. Admin User Management</w:t>
+      </w:r>
+    </w:p>
+    <w:p>
+      <w:pPr>
+        <w:pStyle w:val="ListBullet"/>
+      </w:pPr>
+      <w:r>
+        <w:t>✅  Users section on the dashboard (admin only) — lists every account with its role</w:t>
+      </w:r>
+    </w:p>
+    <w:p>
+      <w:pPr>
+        <w:pStyle w:val="ListBullet"/>
+      </w:pPr>
+      <w:r>
+        <w:t>✅  Add User modal — username, password (scrypt-hashed), and role (admin / viewer)</w:t>
+      </w:r>
+    </w:p>
+    <w:p>
+      <w:pPr>
+        <w:pStyle w:val="ListBullet"/>
+      </w:pPr>
+      <w:r>
+        <w:t>✅  Inline role toggle — flip a user between admin and viewer with one click</w:t>
+      </w:r>
+    </w:p>
+    <w:p>
+      <w:pPr>
+        <w:pStyle w:val="ListBullet"/>
+      </w:pPr>
+      <w:r>
+        <w:t>✅  Delete user — removes the account and invalidates their active sessions immediately</w:t>
+      </w:r>
+    </w:p>
+    <w:p>
+      <w:pPr>
+        <w:pStyle w:val="ListBullet"/>
+      </w:pPr>
+      <w:r>
+        <w:t>✅  Self-protection — admins cannot change their own role or delete their own account, to prevent lockout</w:t>
+      </w:r>
+    </w:p>
+    <w:p>
+      <w:pPr>
+        <w:pStyle w:val="ListBullet"/>
+      </w:pPr>
+      <w:r>
+        <w:t>✅  Backed by the existing config.json credentials array — no new storage format</w:t>
+      </w:r>
+    </w:p>
+    <w:p>
+      <w:pPr>
         <w:pStyle w:val="Heading1"/>
       </w:pPr>
       <w:r>
@@ -2050,7 +2202,7 @@
         <w:rPr>
           <w:color w:val="64748B"/>
         </w:rPr>
-        <w:t xml:space="preserve">⬜  </w:t>
+        <w:t>✅  Admin user management UI — add/remove users without editing config.json</w:t>
       </w:r>
       <w:r>
         <w:t>Admin user management UI — add/remove users without editing config.json</w:t>
@@ -2094,7 +2246,7 @@
           <w:color w:val="94A3B8"/>
           <w:sz w:val="18"/>
         </w:rPr>
-        <w:t>Updated by Claude Code (claude-sonnet-4-6) — June 9, 2026</w:t>
+        <w:t>Updated by Claude Code (claude-sonnet-4-6) — June 22, 2026</w:t>
       </w:r>
     </w:p>
     <w:sectPr>

</xml_diff>

<commit_message>
docs: add claudeapps server details and update project brief
Co-Authored-By: Claude Sonnet 4.6 <noreply@anthropic.com>
</commit_message>
<xml_diff>
--- a/PulseWatch v2.docx
+++ b/PulseWatch v2.docx
@@ -22,7 +22,7 @@
         <w:rPr>
           <w:color w:val="64748B"/>
         </w:rPr>
-        <w:t>Updated: June 22, 2026</w:t>
+        <w:t>Updated: June 24, 2026</w:t>
       </w:r>
     </w:p>
     <w:p/>
@@ -1920,7 +1920,7 @@
         <w:t xml:space="preserve">Portainer  </w:t>
       </w:r>
       <w:r>
-        <w:t>— https://docker.newtekk.com  |  HTTP  |  1000ms degraded</w:t>
+        <w:t>— https://docker.newtekk.com  |  HTTP  |  1000ms degraded, alert after 3 fails</w:t>
       </w:r>
     </w:p>
     <w:p>
@@ -1963,6 +1963,76 @@
       </w:r>
       <w:r>
         <w:t>— 1.1.1.1  |  TCP  |  60s interval, 1000ms degraded</w:t>
+      </w:r>
+    </w:p>
+    <w:p>
+      <w:pPr>
+        <w:pStyle w:val="ListBullet"/>
+      </w:pPr>
+      <w:r>
+        <w:rPr>
+          <w:b/>
+        </w:rPr>
+        <w:t xml:space="preserve">Google DNS  </w:t>
+      </w:r>
+      <w:r>
+        <w:t>— 8.8.8.8  |  PING  |  1000ms degraded</w:t>
+      </w:r>
+    </w:p>
+    <w:p>
+      <w:pPr>
+        <w:pStyle w:val="ListBullet"/>
+      </w:pPr>
+      <w:r>
+        <w:rPr>
+          <w:b/>
+        </w:rPr>
+        <w:t xml:space="preserve">Field2Base Admin Portal  </w:t>
+      </w:r>
+      <w:r>
+        <w:t>— admin.field2base.com  |  PING  |  120s interval, 1000ms degraded</w:t>
+      </w:r>
+    </w:p>
+    <w:p>
+      <w:pPr>
+        <w:pStyle w:val="ListBullet"/>
+      </w:pPr>
+      <w:r>
+        <w:rPr>
+          <w:b/>
+        </w:rPr>
+        <w:t xml:space="preserve">F2B Admin Portal  </w:t>
+      </w:r>
+      <w:r>
+        <w:t>— https://admin.field2base.com/Portal/Account/Login  |  HTTP  |  120s interval</w:t>
+      </w:r>
+    </w:p>
+    <w:p>
+      <w:pPr>
+        <w:pStyle w:val="ListBullet"/>
+      </w:pPr>
+      <w:r>
+        <w:rPr>
+          <w:b/>
+        </w:rPr>
+        <w:t xml:space="preserve">F2B Dev Portal  </w:t>
+      </w:r>
+      <w:r>
+        <w:t>— https://dev.field2base.com  |  HTTP  |  120s interval, 1000ms degraded</w:t>
+      </w:r>
+    </w:p>
+    <w:p>
+      <w:pPr>
+        <w:pStyle w:val="ListBullet"/>
+      </w:pPr>
+      <w:r>
+        <w:rPr>
+          <w:b/>
+        </w:rPr>
+        <w:t xml:space="preserve">SecureScout  </w:t>
+      </w:r>
+      <w:r>
+        <w:t>— https://security.newtekk.com  |  HTTP  |  1000ms degraded</w:t>
       </w:r>
     </w:p>
     <w:p/>
@@ -2246,7 +2316,7 @@
           <w:color w:val="94A3B8"/>
           <w:sz w:val="18"/>
         </w:rPr>
-        <w:t>Updated by Claude Code (claude-sonnet-4-6) — June 22, 2026</w:t>
+        <w:t>Updated by Claude Code (claude-sonnet-4-6) — June 24, 2026</w:t>
       </w:r>
     </w:p>
     <w:sectPr>

</xml_diff>